<commit_message>
docs: manual actualizado — simulación bifacial (fachadas adosadas), aporte trasero en Producción/Reporte, selector multi-modelo y alertas de extracción en catálogo de inversores, bifacialidad en catálogo de paneles PDF
</commit_message>
<xml_diff>
--- a/entregables/MANUAL_CALCULADORA_BIPV_v3_agosto2026.docx
+++ b/entregables/MANUAL_CALCULADORA_BIPV_v3_agosto2026.docx
@@ -1116,6 +1116,118 @@
     </w:p>
     <w:p>
       <w:pPr>
+        <w:pStyle w:val="Ttulo3"/>
+      </w:pPr>
+      <w:r>
+        <w:t>Simulación bifacial 🔄  NUEVO</w:t>
+      </w:r>
+    </w:p>
+    <w:p>
+      <w:pPr/>
+      <w:r>
+        <w:t>Si el panel del proyecto es bifacial (capta luz también por la cara trasera), la página 2 muestra el expander «🔄 Simulación bifacial». Se activa automáticamente cuando el panel elegido tiene el dato de bifacialidad en el catálogo (columna BifacialidadPct); si no lo tiene, puedes activarlo manualmente e ingresar el valor de la ficha técnica.</w:t>
+      </w:r>
+    </w:p>
+    <w:p>
+      <w:pPr/>
+      <w:r>
+        <w:t>Controles disponibles:</w:t>
+      </w:r>
+    </w:p>
+    <w:p>
+      <w:pPr>
+        <w:pStyle w:val="Listaconvietas"/>
+      </w:pPr>
+      <w:r>
+        <w:t>Bifacialidad (%): cuánto rinde la cara trasera respecto a la frontal (típico 70–85 % en paneles vidrio-vidrio). Sale de la ficha técnica del panel.</w:t>
+      </w:r>
+    </w:p>
+    <w:p>
+      <w:pPr>
+        <w:pStyle w:val="Listaconvietas"/>
+      </w:pPr>
+      <w:r>
+        <w:t>Altura de montaje (m): distancia del borde inferior del panel al suelo. A mayor altura, más luz reflejada llega a la cara trasera.</w:t>
+      </w:r>
+    </w:p>
+    <w:p>
+      <w:pPr>
+        <w:pStyle w:val="Listaconvietas"/>
+      </w:pPr>
+      <w:r>
+        <w:t>Albedo trasero: reflectividad de la superficie bajo/detrás del panel (0.20 pasto/concreto gris, 0.50 membrana blanca, 0.80 pintura reflectiva).</w:t>
+      </w:r>
+    </w:p>
+    <w:p>
+      <w:pPr>
+        <w:pStyle w:val="Listaconvietas"/>
+      </w:pPr>
+      <w:r>
+        <w:t>GCR (Ground Coverage Ratio): qué tan juntas están las filas de paneles. Filas muy juntas (GCR alto) se sombrean entre sí y reducen la ganancia.</w:t>
+      </w:r>
+    </w:p>
+    <w:p>
+      <w:pPr/>
+      <w:r>
+        <w:t>El cálculo usa el modelo infinite_sheds de pvlib: la POA global incluye la cara frontal (con sombreado fila a fila) más la trasera ponderada por la bifacialidad. La métrica «Ganancia bifacial» muestra el % de energía extra anual, y ese valor viaja automáticamente a Producción, Financiero y Reporte PDF.</w:t>
+      </w:r>
+    </w:p>
+    <w:p>
+      <w:pPr/>
+      <w:r>
+        <w:rPr>
+          <w:b/>
+        </w:rPr>
+        <w:t>⚠️ IMPORTANTE: la ganancia bifacial solo es real si la cara trasera efectivamente recibe luz. No actives bifacial en paneles vidrio-backsheet (opacos) ni esperes ganancias grandes con albedo bajo.</w:t>
+      </w:r>
+    </w:p>
+    <w:p>
+      <w:pPr>
+        <w:pStyle w:val="Ttulo4"/>
+      </w:pPr>
+      <w:r>
+        <w:t>Fachadas verticales: adosada vs ventilada  NUEVO</w:t>
+      </w:r>
+    </w:p>
+    <w:p>
+      <w:pPr/>
+      <w:r>
+        <w:t>Cuando la inclinación es ≥ 80° (fachada vertical), aparece el selector «Montaje de la fachada» con dos opciones:</w:t>
+      </w:r>
+    </w:p>
+    <w:p>
+      <w:pPr>
+        <w:pStyle w:val="Listaconvietas"/>
+      </w:pPr>
+      <w:r>
+        <w:t>Adosada al muro (sellada) — opción por defecto: el panel va pegado al muro y la cara trasera no recibe luz. La app anula automáticamente la ganancia trasera (factor de vista 0) y bloquea el slider de albedo trasero. Es el caso típico BIPV.</w:t>
+      </w:r>
+    </w:p>
+    <w:p>
+      <w:pPr>
+        <w:pStyle w:val="Listaconvietas"/>
+      </w:pPr>
+      <w:r>
+        <w:t>Separación ventilada con superficie reflejante: hay cámara de aire y una superficie clara detrás (muro pintado de blanco, por ejemplo). La ganancia trasera sí aplica y puedes ajustar el albedo trasero.</w:t>
+      </w:r>
+    </w:p>
+    <w:p>
+      <w:pPr/>
+      <w:r>
+        <w:rPr>
+          <w:b/>
+        </w:rPr>
+        <w:t>🚨 ALERTA PARA EVITAR ERRORES: si tu fachada va pegada al muro, deja la opción «Adosada» (la que viene por defecto). Elegir «ventilada» sin que exista la cámara de aire real infla la producción estimada y el proyecto financiero quedará sobreestimado.</w:t>
+      </w:r>
+    </w:p>
+    <w:p>
+      <w:pPr/>
+      <w:r>
+        <w:t>Nota: el slider de Albedo del suelo (parte superior de la página) ahora sí afecta el cálculo de POA. El valor por defecto 0.20 es adecuado para la mayoría de los sitios urbanos.</w:t>
+      </w:r>
+    </w:p>
+    <w:p>
+      <w:pPr>
         <w:pStyle w:val="Ttulo2"/>
       </w:pPr>
       <w:r>
@@ -2664,6 +2776,29 @@
     </w:p>
     <w:p>
       <w:pPr>
+        <w:pStyle w:val="Ttulo3"/>
+      </w:pPr>
+      <w:r>
+        <w:t>Bifacial en multi-superficie  NUEVO</w:t>
+      </w:r>
+    </w:p>
+    <w:p>
+      <w:pPr/>
+      <w:r>
+        <w:t>Al calcular la POA de varias superficies, un checkbox permite heredar la configuración bifacial definida en Recurso Solar (bifacialidad, altura, albedo trasero, GCR) para todas las superficies.</w:t>
+      </w:r>
+    </w:p>
+    <w:p>
+      <w:pPr/>
+      <w:r>
+        <w:rPr>
+          <w:b/>
+        </w:rPr>
+        <w:t>✅ Regla automática: si en Recurso Solar elegiste «fachada adosada», ese bloqueo de la cara trasera aplica SOLO a las superficies verticales (tilt ≥ 80°). Los techos y pérgolas del mismo proyecto conservan su ganancia bifacial normal — no tienes que configurar nada extra.</w:t>
+      </w:r>
+    </w:p>
+    <w:p>
+      <w:pPr>
         <w:pStyle w:val="Ttulo2"/>
       </w:pPr>
       <w:r>
@@ -2888,6 +3023,53 @@
     </w:p>
     <w:p>
       <w:pPr>
+        <w:pStyle w:val="Ttulo3"/>
+      </w:pPr>
+      <w:r>
+        <w:t>Aporte de la cara trasera (bifacial)  NUEVO</w:t>
+      </w:r>
+    </w:p>
+    <w:p>
+      <w:pPr/>
+      <w:r>
+        <w:t>Si la POA vino de una simulación bifacial, aparece la sección «🔆 Aporte de la cara trasera» con tres métricas:</w:t>
+      </w:r>
+    </w:p>
+    <w:p>
+      <w:pPr>
+        <w:pStyle w:val="Listaconvietas"/>
+      </w:pPr>
+      <w:r>
+        <w:t>Cara frontal (POA): irradiación anual sobre la cara frontal, en kWh/m²·año.</w:t>
+      </w:r>
+    </w:p>
+    <w:p>
+      <w:pPr>
+        <w:pStyle w:val="Listaconvietas"/>
+      </w:pPr>
+      <w:r>
+        <w:t>Aporte trasero efectivo: la energía que la cara trasera realmente suma a la simulación, ya ponderada por la bifacialidad del panel (y por el montaje de fachada, si aplica).</w:t>
+      </w:r>
+    </w:p>
+    <w:p>
+      <w:pPr>
+        <w:pStyle w:val="Listaconvietas"/>
+      </w:pPr>
+      <w:r>
+        <w:t>Aporte trasero (%): qué fracción de la POA global proviene de la cara trasera.</w:t>
+      </w:r>
+    </w:p>
+    <w:p>
+      <w:pPr/>
+      <w:r>
+        <w:rPr>
+          <w:b/>
+        </w:rPr>
+        <w:t>⚠️ IMPORTANTE: la E_ac anual YA incluye la ganancia bifacial. No sumes el aporte trasero aparte — hacerlo duplicaría la energía y distorsionaría el análisis financiero.</w:t>
+      </w:r>
+    </w:p>
+    <w:p>
+      <w:pPr>
         <w:pStyle w:val="Ttulo2"/>
       </w:pPr>
       <w:r>
@@ -5796,6 +5978,20 @@
     </w:p>
     <w:p>
       <w:pPr>
+        <w:pStyle w:val="Ttulo3"/>
+      </w:pPr>
+      <w:r>
+        <w:t>Datos bifaciales en el reporte  NUEVO</w:t>
+      </w:r>
+    </w:p>
+    <w:p>
+      <w:pPr/>
+      <w:r>
+        <w:t>Si la simulación bifacial está activa, la sección «Recurso Solar y POA del Sitio» del PDF incluye una tabla adicional con: modelo usado (pvlib infinite_sheds), bifacialidad (%), altura de montaje, albedo trasero y la ganancia bifacial anual (%). Así el cliente y el banco ven de dónde sale la energía extra. Si la simulación bifacial está apagada, el reporte no cambia.</w:t>
+      </w:r>
+    </w:p>
+    <w:p>
+      <w:pPr>
         <w:pStyle w:val="Ttulo2"/>
       </w:pPr>
       <w:r>
@@ -5960,6 +6156,77 @@
     </w:p>
     <w:p>
       <w:pPr>
+        <w:pStyle w:val="Ttulo3"/>
+      </w:pPr>
+      <w:r>
+        <w:t>Fichas con varios modelos: selección obligatoria  NUEVO</w:t>
+      </w:r>
+    </w:p>
+    <w:p>
+      <w:pPr/>
+      <w:r>
+        <w:t>Muchas fichas técnicas (SolaX, Deye, Growatt…) traen una tabla con varios modelos de la misma familia (ej. 75K, 100K, 110K, 125K). Al detectarlo, la app muestra el selector «— Elige un modelo —» y el botón Guardar queda deshabilitado hasta que elijas uno.</w:t>
+      </w:r>
+    </w:p>
+    <w:p>
+      <w:pPr/>
+      <w:r>
+        <w:t>Al elegir el modelo, el formulario se llena con los valores de ESA columna (Vdc máx, corrientes, número de MPPT, potencia FV máx) y el nombre del modelo queda fijado — así el catálogo no se contamina con datos mezclados de otra variante.</w:t>
+      </w:r>
+    </w:p>
+    <w:p>
+      <w:pPr/>
+      <w:r>
+        <w:rPr>
+          <w:b/>
+        </w:rPr>
+        <w:t>🚨 ALERTA PARA EVITAR ERRORES: nunca guardes «la familia» completa. Cada variante tiene corrientes y potencias distintas; guardar la equivocada hace que el emparejamiento de strings en Dimensionamiento dé resultados inválidos.</w:t>
+      </w:r>
+    </w:p>
+    <w:p>
+      <w:pPr>
+        <w:pStyle w:val="Ttulo3"/>
+      </w:pPr>
+      <w:r>
+        <w:t>Alerta de extracción incompleta (campos vacíos)  NUEVO</w:t>
+      </w:r>
+    </w:p>
+    <w:p>
+      <w:pPr/>
+      <w:r>
+        <w:t>Tras procesar el PDF, la app cuenta cuántos campos críticos (voltajes MPPT, trackers, corrientes, potencia FV) quedaron vacíos:</w:t>
+      </w:r>
+    </w:p>
+    <w:p>
+      <w:pPr>
+        <w:pStyle w:val="Listaconvietas"/>
+      </w:pPr>
+      <w:r>
+        <w:rPr>
+          <w:b/>
+        </w:rPr>
+        <w:t>🚨 Error rojo (más de 3 vacíos): el extractor probablemente no reconoció el formato del PDF. Revisa el texto crudo y completa el formulario a mano antes de guardar.</w:t>
+      </w:r>
+    </w:p>
+    <w:p>
+      <w:pPr>
+        <w:pStyle w:val="Listaconvietas"/>
+      </w:pPr>
+      <w:r>
+        <w:rPr>
+          <w:b/>
+        </w:rPr>
+        <w:t>⚠️ Aviso amarillo (1 a 3 vacíos): faltan algunos datos puntuales — verifícalos contra la ficha antes de guardar.</w:t>
+      </w:r>
+    </w:p>
+    <w:p>
+      <w:pPr/>
+      <w:r>
+        <w:t>Esta alerta evita el error silencioso más peligroso: guardar un inversor con campos en blanco que luego rompe el dimensionamiento sin aviso. En PDFs escaneados sin OCR la app muestra su propio mensaje y no duplica esta alerta.</w:t>
+      </w:r>
+    </w:p>
+    <w:p>
+      <w:pPr>
         <w:pStyle w:val="Ttulo2"/>
       </w:pPr>
       <w:r>
@@ -6030,6 +6297,35 @@
           <w:b w:val="0"/>
         </w:rPr>
         <w:t>────────────────────────────────────────────────────────────</w:t>
+      </w:r>
+    </w:p>
+    <w:p>
+      <w:pPr>
+        <w:pStyle w:val="Ttulo2"/>
+      </w:pPr>
+      <w:r>
+        <w:t>13d. Página 14 — Catálogo de Paneles PDF: bifacialidad  NUEVO</w:t>
+      </w:r>
+    </w:p>
+    <w:p>
+      <w:pPr/>
+      <w:r>
+        <w:t>Al subir la ficha técnica de un panel, el extractor ahora también detecta la bifacialidad (patrones como «Bifaciality 80 % ± 5 %», «Bifacial factor 0.85»). El campo «Bifacialidad (%)» aparece pre-llenado en el formulario y se guarda en el catálogo (columna BifacialidadPct).</w:t>
+      </w:r>
+    </w:p>
+    <w:p>
+      <w:pPr/>
+      <w:r>
+        <w:t>Con ese dato guardado, la página 2 activa automáticamente la simulación bifacial al seleccionar el panel — sin ingresar nada a mano.</w:t>
+      </w:r>
+    </w:p>
+    <w:p>
+      <w:pPr/>
+      <w:r>
+        <w:rPr>
+          <w:b/>
+        </w:rPr>
+        <w:t>⚠️ IMPORTANTE: si el panel es monofacial (vidrio-backsheet), deja el campo vacío o en 0. Poner una bifacialidad inventada infla la producción estimada.</w:t>
       </w:r>
     </w:p>
     <w:p>

</xml_diff>

<commit_message>
docs: manual — selector de montaje adosado/ventilado por fachada en Vista 3D multi-superficie (#156)
</commit_message>
<xml_diff>
--- a/entregables/MANUAL_CALCULADORA_BIPV_v3_agosto2026.docx
+++ b/entregables/MANUAL_CALCULADORA_BIPV_v3_agosto2026.docx
@@ -2795,6 +2795,74 @@
           <w:b/>
         </w:rPr>
         <w:t>✅ Regla automática: si en Recurso Solar elegiste «fachada adosada», ese bloqueo de la cara trasera aplica SOLO a las superficies verticales (tilt ≥ 80°). Los techos y pérgolas del mismo proyecto conservan su ganancia bifacial normal — no tienes que configurar nada extra.</w:t>
+      </w:r>
+    </w:p>
+    <w:p>
+      <w:pPr>
+        <w:pStyle w:val="Ttulo4"/>
+      </w:pPr>
+      <w:r>
+        <w:t>Montaje adosado/ventilado por cada fachada  NUEVO</w:t>
+      </w:r>
+    </w:p>
+    <w:p>
+      <w:pPr/>
+      <w:r>
+        <w:t>En el editor de superficies (⚙️ Superficies BIPV), cada superficie con inclinación ≥ 80° muestra ahora su propio selector «🔄 Montaje de la fachada (modelo bifacial)» con tres opciones:</w:t>
+      </w:r>
+    </w:p>
+    <w:p>
+      <w:pPr>
+        <w:pStyle w:val="Listaconvietas"/>
+      </w:pPr>
+      <w:r>
+        <w:t>Heredar de ☀️ Recurso Solar — opción por defecto: usa el montaje (adosada o ventilada) que elegiste en la página 2. Si no necesitas diferenciar fachadas, no toques nada.</w:t>
+      </w:r>
+    </w:p>
+    <w:p>
+      <w:pPr>
+        <w:pStyle w:val="Listaconvietas"/>
+      </w:pPr>
+      <w:r>
+        <w:t>Adosada al muro (sellada): la cara trasera de ESTA fachada no recibe luz — su ganancia bifacial se anula automáticamente, sin afectar a las demás superficies.</w:t>
+      </w:r>
+    </w:p>
+    <w:p>
+      <w:pPr>
+        <w:pStyle w:val="Listaconvietas"/>
+      </w:pPr>
+      <w:r>
+        <w:t>Ventilada con superficie reflejante: ESTA fachada tiene cámara de aire con superficie clara detrás — su ganancia bifacial sí aplica.</w:t>
+      </w:r>
+    </w:p>
+    <w:p>
+      <w:pPr/>
+      <w:r>
+        <w:t>Esto permite modelar proyectos reales mixtos: por ejemplo, una fachada sur adosada al muro (ganancia 0), una fachada oriente ventilada con muro blanco (ganancia normal) y un techo bifacial — cada una con su cálculo correcto en la misma corrida.</w:t>
+      </w:r>
+    </w:p>
+    <w:p>
+      <w:pPr/>
+      <w:r>
+        <w:rPr>
+          <w:b/>
+        </w:rPr>
+        <w:t>🚨 ALERTA PARA EVITAR ERRORES: marca «Ventilada» solo si la cámara de aire y la superficie reflejante existen físicamente en ESA fachada. Marcarla sin serlo infla la producción de esa superficie y contamina el total del proyecto que llega al Financiero.</w:t>
+      </w:r>
+    </w:p>
+    <w:p>
+      <w:pPr/>
+      <w:r>
+        <w:rPr>
+          <w:b/>
+        </w:rPr>
+        <w:t>⚠️ IMPORTANTE: los techos y pérgolas (inclinación &lt; 80°) no muestran este selector y nunca se ven afectados por el montaje de las fachadas — conservan siempre su ganancia bifacial normal.</w:t>
+      </w:r>
+    </w:p>
+    <w:p>
+      <w:pPr/>
+      <w:r>
+        <w:t>Nota: al eliminar una superficie de la lista, las demás conservan sus valores (nombre, montaje, tilt, área). Puedes agregar y quitar superficies con confianza.</w:t>
       </w:r>
     </w:p>
     <w:p>

</xml_diff>

<commit_message>
docs: manual v3 — secciones nuevas: modo curva IV real en Producción (#105), exportar cotización cliente (#109) y strings en un mismo MPPT (#157)
</commit_message>
<xml_diff>
--- a/entregables/MANUAL_CALCULADORA_BIPV_v3_agosto2026.docx
+++ b/entregables/MANUAL_CALCULADORA_BIPV_v3_agosto2026.docx
@@ -2645,6 +2645,80 @@
     </w:p>
     <w:p>
       <w:pPr>
+        <w:pStyle w:val="Ttulo4"/>
+      </w:pPr>
+      <w:r>
+        <w:t>Sección 6 — Strings de distinta orientación en un mismo MPPT  NUEVO</w:t>
+      </w:r>
+    </w:p>
+    <w:p>
+      <w:r>
+        <w:t>Cuando dos superficies con orientaciones distintas (p. ej. fachada Este y fachada Oeste) se conectan en paralelo a la MISMA entrada MPPT del inversor, éste impone un solo voltaje de operación para todas. La app resuelve hora a hora la curva IV combinada (suma de las corrientes de los strings) y la compara contra el caso ideal de un MPPT por orientación, para cuantificar cuánta energía se pierde por compartir el MPPT.</w:t>
+      </w:r>
+    </w:p>
+    <w:p>
+      <w:pPr>
+        <w:pStyle w:val="Listaconvietas"/>
+      </w:pPr>
+      <w:r>
+        <w:t>Panel fotovoltaico: solo aparecen paneles con ficha SDM completa (Motor IV).</w:t>
+      </w:r>
+    </w:p>
+    <w:p>
+      <w:pPr>
+        <w:pStyle w:val="Listaconvietas"/>
+      </w:pPr>
+      <w:r>
+        <w:t>Módulos en serie por string: igual para todas las superficies; los strings en paralelo se calculan por área.</w:t>
+      </w:r>
+    </w:p>
+    <w:p>
+      <w:pPr>
+        <w:pStyle w:val="Listaconvietas"/>
+      </w:pPr>
+      <w:r>
+        <w:t>Nº de MPPTs del inversor: se toma automáticamente de la ficha del inversor del Dimensionamiento si existe.</w:t>
+      </w:r>
+    </w:p>
+    <w:p>
+      <w:pPr>
+        <w:pStyle w:val="Listaconvietas"/>
+      </w:pPr>
+      <w:r>
+        <w:t>Asignación superficie → MPPT: dos o más superficies en el mismo MPPT = strings en paralelo compartiendo voltaje.</w:t>
+      </w:r>
+    </w:p>
+    <w:p>
+      <w:pPr>
+        <w:pStyle w:val="Listaconvietas"/>
+      </w:pPr>
+      <w:r>
+        <w:t>Resultados: E_dc ideal vs E_dc con MPPT compartido, pérdida por mismatch total y por MPPT, y gráfica de la curva IV combinada de la peor hora del año.</w:t>
+      </w:r>
+    </w:p>
+    <w:p>
+      <w:r>
+        <w:t>Semáforo de decisión: 🟢 pérdida &lt; 0.5% = compartir MPPT es aceptable · 🟠 0.5–2% = evaluar si el ahorro del inversor compensa · 🔴 &gt; 2% = se recomienda un MPPT por orientación o un inversor con más MPPTs.</w:t>
+      </w:r>
+    </w:p>
+    <w:p>
+      <w:r>
+        <w:rPr>
+          <w:b/>
+        </w:rPr>
+        <w:t>⚠️ IMPORTANTE: esta sección es INFORMATIVA — no modifica la E_ac oficial que usan Financiero, Baterías y CO₂. Úsala para decidir el diseño eléctrico antes de comprar el inversor.</w:t>
+      </w:r>
+    </w:p>
+    <w:p>
+      <w:r>
+        <w:rPr>
+          <w:b/>
+        </w:rPr>
+        <w:t>✅ Regla: si cada superficie tiene su propio MPPT, la pérdida es 0 y no necesitas esta simulación; ejecútala solo cuando el inversor tiene menos MPPTs que orientaciones.</w:t>
+      </w:r>
+    </w:p>
+    <w:p>
+      <w:pPr>
         <w:pStyle w:val="Ttulo3"/>
       </w:pPr>
       <w:r>
@@ -3138,6 +3212,67 @@
     </w:p>
     <w:p>
       <w:pPr>
+        <w:pStyle w:val="Ttulo3"/>
+      </w:pPr>
+      <w:r>
+        <w:t>Modo curva IV real del panel (Motor IV)  NUEVO</w:t>
+      </w:r>
+    </w:p>
+    <w:p>
+      <w:r>
+        <w:t>Además del modelo hora a hora estándar, la página 6 puede calcular la producción usando la curva I-V real del panel (modelo de un diodo De Soto calibrado con la ficha técnica). El toggle «🔬 Usar curva IV real» aparece SOLO si el panel tiene ficha SDM completa (I_L_ref, I_o_ref, R_s, R_sh_ref, a_ref, coeficientes térmicos).</w:t>
+      </w:r>
+    </w:p>
+    <w:p>
+      <w:pPr>
+        <w:pStyle w:val="Listaconvietas"/>
+      </w:pPr>
+      <w:r>
+        <w:t>Con el toggle apagado (por defecto) todo funciona exactamente igual que antes.</w:t>
+      </w:r>
+    </w:p>
+    <w:p>
+      <w:pPr>
+        <w:pStyle w:val="Listaconvietas"/>
+      </w:pPr>
+      <w:r>
+        <w:t>Con el toggle encendido se corren AMBOS modelos y se muestra la comparación: E_ac de cada uno y % de diferencia.</w:t>
+      </w:r>
+    </w:p>
+    <w:p>
+      <w:pPr>
+        <w:pStyle w:val="Listaconvietas"/>
+      </w:pPr>
+      <w:r>
+        <w:t>Si ambos coinciden dentro de ±10%, la E_ac oficial aguas abajo pasa a ser la del modelo de curva IV.</w:t>
+      </w:r>
+    </w:p>
+    <w:p>
+      <w:pPr>
+        <w:pStyle w:val="Listaconvietas"/>
+      </w:pPr>
+      <w:r>
+        <w:t>El cálculo es vectorizado: las 8.760 horas del año se resuelven en menos de un segundo.</w:t>
+      </w:r>
+    </w:p>
+    <w:p>
+      <w:r>
+        <w:rPr>
+          <w:b/>
+        </w:rPr>
+        <w:t>🚨 ALERTA PARA EVITAR ERRORES: si la diferencia entre los dos modelos supera ±10%, la app muestra alerta roja — es señal de datos de ficha inconsistentes (Voc/Isc/Vmp/Imp, N_s half-cut o parámetros SDM mal calibrados). Revisa la ficha en 🔬 Motor IV antes de usar ese resultado en el análisis financiero.</w:t>
+      </w:r>
+    </w:p>
+    <w:p>
+      <w:r>
+        <w:rPr>
+          <w:b/>
+        </w:rPr>
+        <w:t>✅ Regla: usa el modo curva IV cuando el panel tenga ficha completa verificada — es más preciso en horas de baja irradiancia y en climas fríos, donde el modelo lineal subestima o sobreestima.</w:t>
+      </w:r>
+    </w:p>
+    <w:p>
+      <w:pPr>
         <w:pStyle w:val="Ttulo2"/>
       </w:pPr>
       <w:r>
@@ -5446,6 +5581,67 @@
           <w:sz w:val="16"/>
         </w:rPr>
         <w:t>────────────────────────────────────────────────────────────</w:t>
+      </w:r>
+    </w:p>
+    <w:p>
+      <w:pPr>
+        <w:pStyle w:val="Ttulo3"/>
+      </w:pPr>
+      <w:r>
+        <w:t>📤 Exportar cotización para el cliente (Excel / PDF)  NUEVO</w:t>
+      </w:r>
+    </w:p>
+    <w:p>
+      <w:r>
+        <w:t>Al final de la página 8 — Presupuesto está la sección «📤 Exportar cotización»: genera un documento limpio para entregar al cliente, con los ítems activos agrupados por categoría, subtotal (CAPEX directo), costos blandos, indirectos, contingencia y TOTAL en pesos colombianos (formato $ 12.345.678), más el equivalente en USD con la TRM del proyecto.</w:t>
+      </w:r>
+    </w:p>
+    <w:p>
+      <w:pPr>
+        <w:pStyle w:val="Listaconvietas"/>
+      </w:pPr>
+      <w:r>
+        <w:t>Campos editables: nombre del cliente/destinatario, validez de la oferta (15 días por defecto) y notas/condiciones del pie.</w:t>
+      </w:r>
+    </w:p>
+    <w:p>
+      <w:pPr>
+        <w:pStyle w:val="Listaconvietas"/>
+      </w:pPr>
+      <w:r>
+        <w:t>Dos botones de descarga: Cotizacion_&lt;proyecto&gt;_&lt;fecha&gt;.xlsx y .pdf.</w:t>
+      </w:r>
+    </w:p>
+    <w:p>
+      <w:pPr>
+        <w:pStyle w:val="Listaconvietas"/>
+      </w:pPr>
+      <w:r>
+        <w:t>Solo se exportan ítems con la casilla «✔ Activo» marcada y con cantidad y precio mayores que cero.</w:t>
+      </w:r>
+    </w:p>
+    <w:p>
+      <w:pPr>
+        <w:pStyle w:val="Listaconvietas"/>
+      </w:pPr>
+      <w:r>
+        <w:t>El documento NO incluye la columna de fuente de precios ni los KPIs bancarios — es apto para entregar al cliente final.</w:t>
+      </w:r>
+    </w:p>
+    <w:p>
+      <w:r>
+        <w:rPr>
+          <w:b/>
+        </w:rPr>
+        <w:t>⚠️ IMPORTANTE: el total de la cotización se calcula SIEMPRE desde los mismos ítems que se exportan (subtotal + blandos + indirectos + contingencia). Si difiere más de 1% del CAPEX del Resumen, la app lo avisa — suele pasar cuando la Estimación Rápida sigue aplicada o hay ítems desactivados; recalcula el Resumen si quieres que coincidan.</w:t>
+      </w:r>
+    </w:p>
+    <w:p>
+      <w:r>
+        <w:rPr>
+          <w:b/>
+        </w:rPr>
+        <w:t>🚨 ALERTA PARA EVITAR ERRORES: si los botones de descarga aparecen deshabilitados es porque no hay ítems activos con valor. Completa al menos una pestaña de cotización (o aplica la 🧮 Estimación Rápida y luego ingresa cotizaciones reales).</w:t>
       </w:r>
     </w:p>
     <w:p>

</xml_diff>

<commit_message>
Manual v3: anexo con actualizaciones del 5-ago-2026 (agrivoltaica, Motor IV auto, precio inversor, Ns half-cut)
</commit_message>
<xml_diff>
--- a/entregables/MANUAL_CALCULADORA_BIPV_v3_agosto2026.docx
+++ b/entregables/MANUAL_CALCULADORA_BIPV_v3_agosto2026.docx
@@ -213,6 +213,21 @@
       </w:r>
     </w:p>
     <w:p>
+      <w:pPr>
+        <w:pStyle w:val="Listaconnmeros"/>
+      </w:pPr>
+      <w:r>
+        <w:t xml:space="preserve">Anexo — Actualizaciones 5 de agosto 2026 (agrivoltaica y Motor IV)  </w:t>
+      </w:r>
+      <w:r>
+        <w:rPr>
+          <w:b/>
+          <w:color w:val="E65100"/>
+        </w:rPr>
+        <w:t>NUEVO</w:t>
+      </w:r>
+    </w:p>
+    <w:p>
       <w:r>
         <w:rPr>
           <w:sz w:val="16"/>
@@ -7942,6 +7957,309 @@
       </w:r>
     </w:p>
     <w:p>
+      <w:r>
+        <w:rPr>
+          <w:b w:val="0"/>
+        </w:rPr>
+        <w:t>────────────────────────────────────────────────────────────</w:t>
+      </w:r>
+    </w:p>
+    <w:p>
+      <w:pPr>
+        <w:pStyle w:val="Ttulo2"/>
+      </w:pPr>
+      <w:r>
+        <w:rPr>
+          <w:b w:val="0"/>
+          <w:color w:val="1A5376"/>
+        </w:rPr>
+        <w:t>18. Anexo — Actualizaciones del 5 de agosto de 2026</w:t>
+      </w:r>
+    </w:p>
+    <w:p>
+      <w:r>
+        <w:rPr>
+          <w:b w:val="0"/>
+        </w:rPr>
+        <w:t>Esta entrega incorpora el soporte completo para proyectos agrivoltaicos (cultivo bajo paneles), la activación automática del Motor IV y el uso del precio real del inversor en el análisis financiero.</w:t>
+      </w:r>
+    </w:p>
+    <w:p>
+      <w:r>
+        <w:rPr>
+          <w:b w:val="0"/>
+        </w:rPr>
+        <w:t>────────────────────────────────────────────────────────────</w:t>
+      </w:r>
+    </w:p>
+    <w:p>
+      <w:r>
+        <w:rPr>
+          <w:b/>
+        </w:rPr>
+        <w:t>18.1 Página 1 — Proyecto: Factor de ocupación con paneles (agrivoltaica)  ACTUALIZADO</w:t>
+      </w:r>
+    </w:p>
+    <w:p>
+      <w:r>
+        <w:rPr>
+          <w:b w:val="0"/>
+        </w:rPr>
+        <w:t>Nuevo campo "Factor de ocupación con paneles (%)" (rango 5–100, por defecto 100). Define qué porcentaje del terreno bruto queda cubierto por paneles; el resto queda libre para el cultivo. La app calcula el área útil = área × factor/100 y la usa en Dimensionamiento, Presupuesto y Reporte PDF.</w:t>
+      </w:r>
+    </w:p>
+    <w:p>
+      <w:pPr>
+        <w:pStyle w:val="Listaconvietas"/>
+      </w:pPr>
+      <w:r>
+        <w:rPr>
+          <w:b w:val="0"/>
+        </w:rPr>
+        <w:t>Ejemplo: terreno de 3 000 m² con factor 30% → 900 m² útiles para paneles (~340 paneles en vez de ~1 040) y 2 100 m² libres para el cultivo.</w:t>
+      </w:r>
+    </w:p>
+    <w:p>
+      <w:pPr>
+        <w:pStyle w:val="Listaconvietas"/>
+      </w:pPr>
+      <w:r>
+        <w:rPr>
+          <w:b w:val="0"/>
+        </w:rPr>
+        <w:t>El factor se guarda en el proyecto (proyecto_actual.json) y se restaura al recargarlo.</w:t>
+      </w:r>
+    </w:p>
+    <w:p>
+      <w:r>
+        <w:rPr>
+          <w:b/>
+          <w:color w:val="E65100"/>
+        </w:rPr>
+        <w:t>⚠️ Para no cometer errores: si tu proyecto es una granja con cultivo, ajusta el factor ANTES de pasar a Dimensionamiento. Si lo dejas en 100%, el conteo de paneles, el presupuesto y el USD/m² se calcularán como si todo el terreno llevara paneles.</w:t>
+      </w:r>
+    </w:p>
+    <w:p>
+      <w:r>
+        <w:rPr>
+          <w:b w:val="0"/>
+        </w:rPr>
+        <w:t>────────────────────────────────────────────────────────────</w:t>
+      </w:r>
+    </w:p>
+    <w:p>
+      <w:r>
+        <w:rPr>
+          <w:b/>
+        </w:rPr>
+        <w:t>18.2 Página 2 — Recurso Solar: GCR sincronizado con el factor de ocupación  ACTUALIZADO</w:t>
+      </w:r>
+    </w:p>
+    <w:p>
+      <w:r>
+        <w:rPr>
+          <w:b w:val="0"/>
+        </w:rPr>
+        <w:t>El control "GCR (cobertura del suelo)" del modelo bifacial ahora arranca con el mismo valor que el factor de ocupación definido en Proyecto (factor 30% → GCR 0.30), porque ambos representan la misma fracción de suelo cubierta por paneles. La sincronización solo aplica la primera vez; después se respeta el valor que guardes aquí.</w:t>
+      </w:r>
+    </w:p>
+    <w:p>
+      <w:pPr>
+        <w:pStyle w:val="Listaconvietas"/>
+      </w:pPr>
+      <w:r>
+        <w:rPr>
+          <w:b w:val="0"/>
+        </w:rPr>
+        <w:t>Si el GCR y el factor difieren en más de 15 puntos, aparece una alerta con el valor sugerido — el sombreado entre filas y el conteo de paneles estarían usando supuestos distintos.</w:t>
+      </w:r>
+    </w:p>
+    <w:p>
+      <w:r>
+        <w:rPr>
+          <w:b/>
+          <w:color w:val="E65100"/>
+        </w:rPr>
+        <w:t>⚠️ Para no cometer errores: no subas el GCR "para producir más" sin cambiar también el factor de ocupación en Proyecto. Un GCR alto junta las filas (más sombra mutua y menos luz al cultivo); mantén ambos valores alineados.</w:t>
+      </w:r>
+    </w:p>
+    <w:p>
+      <w:r>
+        <w:rPr>
+          <w:b w:val="0"/>
+        </w:rPr>
+        <w:t>────────────────────────────────────────────────────────────</w:t>
+      </w:r>
+    </w:p>
+    <w:p>
+      <w:r>
+        <w:rPr>
+          <w:b/>
+        </w:rPr>
+        <w:t>18.3 Página 9 — Vista 3D: modo Granja agrivoltaica  NUEVO</w:t>
+      </w:r>
+    </w:p>
+    <w:p>
+      <w:r>
+        <w:rPr>
+          <w:b w:val="0"/>
+        </w:rPr>
+        <w:t>Cuando el tipo de instalación es "Granja fotovoltaica", la Vista 3D ya no dibuja un edificio: muestra el terreno completo en verde (el cultivo) con las filas de paneles inclinadas y elevadas a 3 m cuando el factor de ocupación es menor a 100%.</w:t>
+      </w:r>
+    </w:p>
+    <w:p>
+      <w:pPr>
+        <w:pStyle w:val="Listaconvietas"/>
+      </w:pPr>
+      <w:r>
+        <w:rPr>
+          <w:b w:val="0"/>
+        </w:rPr>
+        <w:t>La separación entre filas se calcula como ancho del colector ÷ GCR (con 30% de ocupación, ~3.7 m entre ejes de filas).</w:t>
+      </w:r>
+    </w:p>
+    <w:p>
+      <w:pPr>
+        <w:pStyle w:val="Listaconvietas"/>
+      </w:pPr>
+      <w:r>
+        <w:rPr>
+          <w:b w:val="0"/>
+        </w:rPr>
+        <w:t>Un resumen indica número de filas, separación, altura de montaje y porcentaje de suelo libre para el cultivo.</w:t>
+      </w:r>
+    </w:p>
+    <w:p>
+      <w:r>
+        <w:rPr>
+          <w:b w:val="0"/>
+          <w:color w:val="1B5E20"/>
+        </w:rPr>
+        <w:t>Nota: la vista muestra las filas como bandas continuas, no módulos individuales. El conteo oficial de paneles sigue siendo el de la Página 4 — Dimensionamiento.</w:t>
+      </w:r>
+    </w:p>
+    <w:p>
+      <w:r>
+        <w:rPr>
+          <w:b w:val="0"/>
+        </w:rPr>
+        <w:t>────────────────────────────────────────────────────────────</w:t>
+      </w:r>
+    </w:p>
+    <w:p>
+      <w:r>
+        <w:rPr>
+          <w:b/>
+        </w:rPr>
+        <w:t>18.4 Página 7 — Financiero: precio real del inversor del catálogo  ACTUALIZADO</w:t>
+      </w:r>
+    </w:p>
+    <w:p>
+      <w:r>
+        <w:rPr>
+          <w:b w:val="0"/>
+        </w:rPr>
+        <w:t>El precio del inversor seleccionado en el catálogo fluye automáticamente al análisis financiero, en lugar de usar un estimado genérico por kW.</w:t>
+      </w:r>
+    </w:p>
+    <w:p>
+      <w:r>
+        <w:rPr>
+          <w:b/>
+          <w:color w:val="E65100"/>
+        </w:rPr>
+        <w:t>⚠️ Para no cometer errores: verifica que la ficha del inversor en el catálogo tenga precio cargado. Si el campo está vacío, revisa el valor que aparece en Financiero antes de generar el presupuesto.</w:t>
+      </w:r>
+    </w:p>
+    <w:p>
+      <w:r>
+        <w:rPr>
+          <w:b w:val="0"/>
+        </w:rPr>
+        <w:t>────────────────────────────────────────────────────────────</w:t>
+      </w:r>
+    </w:p>
+    <w:p>
+      <w:r>
+        <w:rPr>
+          <w:b/>
+        </w:rPr>
+        <w:t>18.5 Página 3 — Motor IV: activación automática y defensa Ns half-cut  ACTUALIZADO</w:t>
+      </w:r>
+    </w:p>
+    <w:p>
+      <w:r>
+        <w:rPr>
+          <w:b w:val="0"/>
+        </w:rPr>
+        <w:t>Si el panel seleccionado tiene su ficha técnica completa (Voc, Isc, Vmp, Imp, Ns y coeficientes térmicos), el Motor IV se activa automáticamente sin configuración manual.</w:t>
+      </w:r>
+    </w:p>
+    <w:p>
+      <w:pPr>
+        <w:pStyle w:val="Listaconvietas"/>
+      </w:pPr>
+      <w:r>
+        <w:rPr>
+          <w:b w:val="0"/>
+        </w:rPr>
+        <w:t>Nueva defensa para paneles half-cut: el extractor de fichas infiere el número de celdas en serie (Ns) desde el conteo de semiceldas y lo verifica contra el Voc (regla práctica: Ns ≈ Voc / 0.74 en paneles HJT).</w:t>
+      </w:r>
+    </w:p>
+    <w:p>
+      <w:pPr>
+        <w:pStyle w:val="Listaconvietas"/>
+      </w:pPr>
+      <w:r>
+        <w:rPr>
+          <w:b w:val="0"/>
+        </w:rPr>
+        <w:t>Si el Ns auto-extraído es inconsistente, el Motor IV lo corrige al vuelo y el validador físico lo marca en el diagnóstico.</w:t>
+      </w:r>
+    </w:p>
+    <w:p>
+      <w:r>
+        <w:rPr>
+          <w:b/>
+          <w:color w:val="E65100"/>
+        </w:rPr>
+        <w:t>⚠️ Para no cometer errores: en paneles half-cut la ficha suele reportar el TOTAL de semiceldas (p. ej. 144); el Ns eléctrico es la mitad (72) porque hay dos strings en paralelo. Si cargas un panel a mano, verifica el Ns con la regla Voc/0.74.</w:t>
+      </w:r>
+    </w:p>
+    <w:p>
+      <w:r>
+        <w:rPr>
+          <w:b w:val="0"/>
+        </w:rPr>
+        <w:t>────────────────────────────────────────────────────────────</w:t>
+      </w:r>
+    </w:p>
+    <w:p>
+      <w:r>
+        <w:rPr>
+          <w:b/>
+        </w:rPr>
+        <w:t>18.6 Flujo recomendado para proyectos agrivoltaicos</w:t>
+      </w:r>
+    </w:p>
+    <w:p>
+      <w:r>
+        <w:rPr>
+          <w:b w:val="0"/>
+        </w:rPr>
+        <w:t>1 Proyecto (tipo Granja fotovoltaica + factor de ocupación) → 2 Recurso Solar (verificar GCR sincronizado → Calcular POA) → 4 Dimensionamiento (área útil) → 9 Vista 3D (verificación visual de filas y cultivo) → 6 Producción → 7 Financiero → 8 Presupuesto → 10 Reporte PDF.</w:t>
+      </w:r>
+    </w:p>
+    <w:p>
+      <w:r>
+        <w:rPr>
+          <w:b w:val="0"/>
+          <w:color w:val="1B5E20"/>
+        </w:rPr>
+        <w:t>Regla de oro agrivoltaica: factor de ocupación (Proyecto) = GCR (Recurso Solar). Si cambias uno, revisa el otro.</w:t>
+      </w:r>
+    </w:p>
+    <w:p>
       <w:pPr/>
       <w:r>
         <w:rPr>
@@ -7952,12 +8270,12 @@
     </w:p>
     <w:p>
       <w:r>
-        <w:t>Manual actualizado el 4 de agosto de 2026</w:t>
-      </w:r>
-    </w:p>
-    <w:p>
-      <w:r>
-        <w:t>Novedades de esta versión: Catálogo de Inversores por PDF (multi-modelo, fichas en español, OCR y detección de fallos silenciosos) · Verificación de coherencia τ ↔ Isc/Pmax en Motor Óptico · τ aplicada exactamente una vez (sin doble conteo) · Catálogo de baterías robusto (duplicados y encabezados) · Heatmap PVWatts 2× más rápido</w:t>
+        <w:t>Manual actualizado el 5 de agosto de 2026</w:t>
+      </w:r>
+    </w:p>
+    <w:p>
+      <w:r>
+        <w:t>Novedades de esta versión: modo agrivoltaico completo (factor de ocupación, GCR sincronizado, Vista 3D de granja), Motor IV automático con ficha completa, precio real del inversor en Financiero y defensa Ns half-cut.</w:t>
       </w:r>
     </w:p>
     <w:p>

</xml_diff>

<commit_message>
Manual v3: actualizaciones del 5-ago integradas en sus capítulos (sin anexo) y TOC coherente
</commit_message>
<xml_diff>
--- a/entregables/MANUAL_CALCULADORA_BIPV_v3_agosto2026.docx
+++ b/entregables/MANUAL_CALCULADORA_BIPV_v3_agosto2026.docx
@@ -64,167 +64,166 @@
       <w:r>
         <w:t>Flujo de trabajo recomendado</w:t>
       </w:r>
-    </w:p>
-    <w:p>
-      <w:pPr>
-        <w:pStyle w:val="Listaconnmeros"/>
-      </w:pPr>
-      <w:r>
-        <w:t>Página 1 — Proyecto  ACTUALIZADO</w:t>
-      </w:r>
-    </w:p>
-    <w:p>
-      <w:pPr>
-        <w:pStyle w:val="Listaconnmeros"/>
-      </w:pPr>
-      <w:r>
-        <w:t>Página 2 — Recurso Solar  ACTUALIZADO</w:t>
-      </w:r>
-    </w:p>
-    <w:p>
-      <w:pPr>
-        <w:pStyle w:val="Listaconnmeros"/>
-      </w:pPr>
-      <w:r>
-        <w:t>Página 3 — Motor IV</w:t>
-      </w:r>
-    </w:p>
-    <w:p>
-      <w:pPr>
-        <w:pStyle w:val="Listaconnmeros"/>
-      </w:pPr>
-      <w:r>
-        <w:t>Página 4 — Dimensionamiento</w:t>
-      </w:r>
-    </w:p>
-    <w:p>
-      <w:pPr>
-        <w:pStyle w:val="Listaconnmeros"/>
-      </w:pPr>
-      <w:r>
-        <w:t>Página 5b — Motor Óptico</w:t>
-      </w:r>
-    </w:p>
-    <w:p>
-      <w:pPr>
-        <w:pStyle w:val="Listaconnmeros"/>
-      </w:pPr>
-      <w:r>
-        <w:t>Página 5 — Mismatch y Bypass Diodes  NUEVO</w:t>
-      </w:r>
-    </w:p>
-    <w:p>
-      <w:r>
-        <w:t>8b. Página 9 — Vista 3D y Multi-Superficie  NUEVO</w:t>
-      </w:r>
-    </w:p>
-    <w:p>
-      <w:pPr>
-        <w:pStyle w:val="Listaconnmeros"/>
-      </w:pPr>
-      <w:r>
-        <w:t>Página 6 — Producción Anual  ACTUALIZADO</w:t>
-      </w:r>
-    </w:p>
-    <w:p>
-      <w:pPr>
-        <w:pStyle w:val="Listaconnmeros"/>
-      </w:pPr>
-      <w:r>
-        <w:t>Página 7 — Análisis Financiero  ACTUALIZADO</w:t>
-      </w:r>
-    </w:p>
-    <w:p>
-      <w:pPr>
-        <w:pStyle w:val="Listaconnmeros"/>
-      </w:pPr>
-      <w:r>
-        <w:t>Página 8 — Presupuesto Bancable  ACTUALIZADO</w:t>
-      </w:r>
-    </w:p>
-    <w:p>
-      <w:pPr>
-        <w:pStyle w:val="Listaconnmeros"/>
-      </w:pPr>
-      <w:r>
-        <w:t>Página 11 — Baterías y Balance  ACTUALIZADO</w:t>
-      </w:r>
-    </w:p>
-    <w:p>
-      <w:pPr>
-        <w:pStyle w:val="Listaconnmeros"/>
-      </w:pPr>
-      <w:r>
-        <w:t>Página 10 — Reporte PDF  ACTUALIZADO</w:t>
-      </w:r>
-    </w:p>
-    <w:p>
-      <w:pPr>
-        <w:pStyle w:val="Listaconnmeros"/>
-      </w:pPr>
-      <w:r>
-        <w:rPr>
-          <w:b w:val="0"/>
-        </w:rPr>
-        <w:t>Página 15 — Catálogo de Inversores PDF  NUEVO</w:t>
-      </w:r>
-    </w:p>
-    <w:p>
-      <w:pPr>
-        <w:pStyle w:val="Listaconnmeros"/>
-      </w:pPr>
-      <w:r>
-        <w:rPr>
-          <w:b w:val="0"/>
-        </w:rPr>
-        <w:t>Catálogo de Baterías — carga robusta del Excel  ACTUALIZADO</w:t>
-      </w:r>
-    </w:p>
-    <w:p>
-      <w:pPr>
-        <w:pStyle w:val="Listaconnmeros"/>
-      </w:pPr>
-      <w:r>
-        <w:t>Calculadora de Sombreado 3D</w:t>
-      </w:r>
-    </w:p>
-    <w:p>
-      <w:pPr>
-        <w:pStyle w:val="Listaconnmeros"/>
-      </w:pPr>
-      <w:r>
-        <w:t>Cadena completa — bypass y multi-superficie</w:t>
-      </w:r>
-    </w:p>
-    <w:p>
-      <w:pPr>
-        <w:pStyle w:val="Listaconnmeros"/>
-      </w:pPr>
-      <w:r>
-        <w:t>Interpretación de resultados clave</w:t>
-      </w:r>
-    </w:p>
-    <w:p>
-      <w:pPr>
-        <w:pStyle w:val="Listaconnmeros"/>
-      </w:pPr>
-      <w:r>
-        <w:t>Preguntas frecuentes</w:t>
-      </w:r>
-    </w:p>
-    <w:p>
-      <w:pPr>
-        <w:pStyle w:val="Listaconnmeros"/>
-      </w:pPr>
-      <w:r>
-        <w:t xml:space="preserve">Anexo — Actualizaciones 5 de agosto 2026 (agrivoltaica y Motor IV)  </w:t>
-      </w:r>
       <w:r>
         <w:rPr>
           <w:b/>
           <w:color w:val="E65100"/>
         </w:rPr>
-        <w:t>NUEVO</w:t>
+        <w:t xml:space="preserve">  ACTUALIZADO</w:t>
+      </w:r>
+    </w:p>
+    <w:p>
+      <w:pPr>
+        <w:pStyle w:val="Listaconnmeros"/>
+      </w:pPr>
+      <w:r>
+        <w:t>Página 1 — Proyecto  ACTUALIZADO</w:t>
+      </w:r>
+    </w:p>
+    <w:p>
+      <w:pPr>
+        <w:pStyle w:val="Listaconnmeros"/>
+      </w:pPr>
+      <w:r>
+        <w:t>Página 2 — Recurso Solar  ACTUALIZADO</w:t>
+      </w:r>
+    </w:p>
+    <w:p>
+      <w:pPr>
+        <w:pStyle w:val="Listaconnmeros"/>
+      </w:pPr>
+      <w:r>
+        <w:t>Página 3 — Motor IV</w:t>
+      </w:r>
+      <w:r>
+        <w:rPr>
+          <w:b/>
+          <w:color w:val="E65100"/>
+        </w:rPr>
+        <w:t xml:space="preserve">  ACTUALIZADO</w:t>
+      </w:r>
+    </w:p>
+    <w:p>
+      <w:pPr>
+        <w:pStyle w:val="Listaconnmeros"/>
+      </w:pPr>
+      <w:r>
+        <w:t>Página 4 — Dimensionamiento</w:t>
+      </w:r>
+    </w:p>
+    <w:p>
+      <w:pPr>
+        <w:pStyle w:val="Listaconnmeros"/>
+      </w:pPr>
+      <w:r>
+        <w:t>Página 5b — Motor Óptico</w:t>
+      </w:r>
+    </w:p>
+    <w:p>
+      <w:pPr>
+        <w:pStyle w:val="Listaconnmeros"/>
+      </w:pPr>
+      <w:r>
+        <w:t>Página 5 — Mismatch y Bypass Diodes  NUEVO</w:t>
+      </w:r>
+    </w:p>
+    <w:p>
+      <w:r>
+        <w:t>8b. Página 9 — Vista 3D y Multi-Superficie  NUEVO</w:t>
+      </w:r>
+    </w:p>
+    <w:p>
+      <w:pPr>
+        <w:pStyle w:val="Listaconnmeros"/>
+      </w:pPr>
+      <w:r>
+        <w:t>Página 6 — Producción Anual  ACTUALIZADO</w:t>
+      </w:r>
+    </w:p>
+    <w:p>
+      <w:pPr>
+        <w:pStyle w:val="Listaconnmeros"/>
+      </w:pPr>
+      <w:r>
+        <w:t>Página 7 — Análisis Financiero  ACTUALIZADO</w:t>
+      </w:r>
+    </w:p>
+    <w:p>
+      <w:pPr>
+        <w:pStyle w:val="Listaconnmeros"/>
+      </w:pPr>
+      <w:r>
+        <w:t>Página 8 — Presupuesto Bancable  ACTUALIZADO</w:t>
+      </w:r>
+    </w:p>
+    <w:p>
+      <w:pPr>
+        <w:pStyle w:val="Listaconnmeros"/>
+      </w:pPr>
+      <w:r>
+        <w:t>Página 11 — Baterías y Balance  ACTUALIZADO</w:t>
+      </w:r>
+    </w:p>
+    <w:p>
+      <w:pPr>
+        <w:pStyle w:val="Listaconnmeros"/>
+      </w:pPr>
+      <w:r>
+        <w:t>Página 10 — Reporte PDF  ACTUALIZADO</w:t>
+      </w:r>
+    </w:p>
+    <w:p>
+      <w:pPr>
+        <w:pStyle w:val="Listaconnmeros"/>
+      </w:pPr>
+      <w:r>
+        <w:rPr>
+          <w:b w:val="0"/>
+        </w:rPr>
+        <w:t>Página 15 — Catálogo de Inversores PDF  NUEVO</w:t>
+      </w:r>
+    </w:p>
+    <w:p>
+      <w:pPr>
+        <w:pStyle w:val="Listaconnmeros"/>
+      </w:pPr>
+      <w:r>
+        <w:rPr>
+          <w:b w:val="0"/>
+        </w:rPr>
+        <w:t>Catálogo de Baterías — carga robusta del Excel  ACTUALIZADO</w:t>
+      </w:r>
+    </w:p>
+    <w:p>
+      <w:pPr>
+        <w:pStyle w:val="Listaconnmeros"/>
+      </w:pPr>
+      <w:r>
+        <w:t>Calculadora de Sombreado 3D</w:t>
+      </w:r>
+    </w:p>
+    <w:p>
+      <w:pPr>
+        <w:pStyle w:val="Listaconnmeros"/>
+      </w:pPr>
+      <w:r>
+        <w:t>Cadena completa — bypass y multi-superficie</w:t>
+      </w:r>
+    </w:p>
+    <w:p>
+      <w:pPr>
+        <w:pStyle w:val="Listaconnmeros"/>
+      </w:pPr>
+      <w:r>
+        <w:t>Interpretación de resultados clave</w:t>
+      </w:r>
+    </w:p>
+    <w:p>
+      <w:pPr>
+        <w:pStyle w:val="Listaconnmeros"/>
+      </w:pPr>
+      <w:r>
+        <w:t>Preguntas frecuentes</w:t>
       </w:r>
     </w:p>
     <w:p>
@@ -455,6 +454,39 @@
     <w:p>
       <w:r>
         <w:rPr>
+          <w:b w:val="0"/>
+        </w:rPr>
+        <w:t>────────────────────────────────────────────────────────────</w:t>
+      </w:r>
+    </w:p>
+    <w:p>
+      <w:r>
+        <w:rPr>
+          <w:b/>
+        </w:rPr>
+        <w:t>Flujo recomendado para proyectos agrivoltaicos  NUEVO (5-ago-2026)</w:t>
+      </w:r>
+    </w:p>
+    <w:p>
+      <w:r>
+        <w:rPr>
+          <w:b w:val="0"/>
+        </w:rPr>
+        <w:t>1 Proyecto (tipo Granja fotovoltaica + factor de ocupación) → 2 Recurso Solar (verificar GCR sincronizado → Calcular POA) → 4 Dimensionamiento (área útil) → 9 Vista 3D (verificación visual de filas y cultivo) → 6 Producción → 7 Financiero → 8 Presupuesto → 10 Reporte PDF.</w:t>
+      </w:r>
+    </w:p>
+    <w:p>
+      <w:r>
+        <w:rPr>
+          <w:b w:val="0"/>
+          <w:color w:val="1B5E20"/>
+        </w:rPr>
+        <w:t>Regla de oro agrivoltaica: factor de ocupación (Proyecto) = GCR (Recurso Solar). Si cambias uno, revisa el otro.</w:t>
+      </w:r>
+    </w:p>
+    <w:p>
+      <w:r>
+        <w:rPr>
           <w:sz w:val="16"/>
         </w:rPr>
         <w:t>────────────────────────────────────────────────────────────</w:t>
@@ -824,6 +856,61 @@
     <w:p>
       <w:r>
         <w:rPr>
+          <w:b w:val="0"/>
+        </w:rPr>
+        <w:t>────────────────────────────────────────────────────────────</w:t>
+      </w:r>
+    </w:p>
+    <w:p>
+      <w:r>
+        <w:rPr>
+          <w:b/>
+        </w:rPr>
+        <w:t>Factor de ocupación con paneles — agrivoltaica  NUEVO (5-ago-2026)</w:t>
+      </w:r>
+    </w:p>
+    <w:p>
+      <w:r>
+        <w:rPr>
+          <w:b w:val="0"/>
+        </w:rPr>
+        <w:t>Nuevo campo "Factor de ocupación con paneles (%)" (rango 5–100, por defecto 100). Define qué porcentaje del terreno bruto queda cubierto por paneles; el resto queda libre para el cultivo. La app calcula el área útil = área × factor/100 y la usa en Dimensionamiento, Presupuesto y Reporte PDF.</w:t>
+      </w:r>
+    </w:p>
+    <w:p>
+      <w:pPr>
+        <w:pStyle w:val="Listaconvietas"/>
+      </w:pPr>
+      <w:r>
+        <w:rPr>
+          <w:b w:val="0"/>
+        </w:rPr>
+        <w:t>Ejemplo: terreno de 3 000 m² con factor 30% → 900 m² útiles para paneles (~340 paneles en vez de ~1 040) y 2 100 m² libres para el cultivo.</w:t>
+      </w:r>
+    </w:p>
+    <w:p>
+      <w:pPr>
+        <w:pStyle w:val="Listaconvietas"/>
+      </w:pPr>
+      <w:r>
+        <w:rPr>
+          <w:b w:val="0"/>
+        </w:rPr>
+        <w:t>El factor se guarda en el proyecto (proyecto_actual.json) y se restaura al recargarlo.</w:t>
+      </w:r>
+    </w:p>
+    <w:p>
+      <w:r>
+        <w:rPr>
+          <w:b/>
+          <w:color w:val="E65100"/>
+        </w:rPr>
+        <w:t>⚠️ Para no cometer errores: si tu proyecto es una granja con cultivo, ajusta el factor ANTES de pasar a Dimensionamiento. Si lo dejas en 100%, el conteo de paneles, el presupuesto y el USD/m² se calcularán como si todo el terreno llevara paneles.</w:t>
+      </w:r>
+    </w:p>
+    <w:p>
+      <w:r>
+        <w:rPr>
           <w:sz w:val="16"/>
         </w:rPr>
         <w:t>────────────────────────────────────────────────────────────</w:t>
@@ -1242,6 +1329,50 @@
       </w:r>
     </w:p>
     <w:p>
+      <w:r>
+        <w:rPr>
+          <w:b w:val="0"/>
+        </w:rPr>
+        <w:t>────────────────────────────────────────────────────────────</w:t>
+      </w:r>
+    </w:p>
+    <w:p>
+      <w:r>
+        <w:rPr>
+          <w:b/>
+        </w:rPr>
+        <w:t>GCR sincronizado con el factor de ocupación  NUEVO (5-ago-2026)</w:t>
+      </w:r>
+    </w:p>
+    <w:p>
+      <w:r>
+        <w:rPr>
+          <w:b w:val="0"/>
+        </w:rPr>
+        <w:t>El control "GCR (cobertura del suelo)" del modelo bifacial ahora arranca con el mismo valor que el factor de ocupación definido en Proyecto (factor 30% → GCR 0.30), porque ambos representan la misma fracción de suelo cubierta por paneles. La sincronización solo aplica la primera vez; después se respeta el valor que guardes aquí.</w:t>
+      </w:r>
+    </w:p>
+    <w:p>
+      <w:pPr>
+        <w:pStyle w:val="Listaconvietas"/>
+      </w:pPr>
+      <w:r>
+        <w:rPr>
+          <w:b w:val="0"/>
+        </w:rPr>
+        <w:t>Si el GCR y el factor difieren en más de 15 puntos, aparece una alerta con el valor sugerido — el sombreado entre filas y el conteo de paneles estarían usando supuestos distintos.</w:t>
+      </w:r>
+    </w:p>
+    <w:p>
+      <w:r>
+        <w:rPr>
+          <w:b/>
+          <w:color w:val="E65100"/>
+        </w:rPr>
+        <w:t>⚠️ Para no cometer errores: no subas el GCR "para producir más" sin cambiar también el factor de ocupación en Proyecto. Un GCR alto junta las filas (más sombra mutua y menos luz al cultivo); mantén ambos valores alineados.</w:t>
+      </w:r>
+    </w:p>
+    <w:p>
       <w:pPr>
         <w:pStyle w:val="Ttulo2"/>
       </w:pPr>
@@ -1308,6 +1439,61 @@
     <w:p>
       <w:r>
         <w:t>en el catálogo. No requiere intervención manual.</w:t>
+      </w:r>
+    </w:p>
+    <w:p>
+      <w:r>
+        <w:rPr>
+          <w:b w:val="0"/>
+        </w:rPr>
+        <w:t>────────────────────────────────────────────────────────────</w:t>
+      </w:r>
+    </w:p>
+    <w:p>
+      <w:r>
+        <w:rPr>
+          <w:b/>
+        </w:rPr>
+        <w:t>Activación automática y defensa Ns half-cut  NUEVO (5-ago-2026)</w:t>
+      </w:r>
+    </w:p>
+    <w:p>
+      <w:r>
+        <w:rPr>
+          <w:b w:val="0"/>
+        </w:rPr>
+        <w:t>Si el panel seleccionado tiene su ficha técnica completa (Voc, Isc, Vmp, Imp, Ns y coeficientes térmicos), el Motor IV se activa automáticamente sin configuración manual.</w:t>
+      </w:r>
+    </w:p>
+    <w:p>
+      <w:pPr>
+        <w:pStyle w:val="Listaconvietas"/>
+      </w:pPr>
+      <w:r>
+        <w:rPr>
+          <w:b w:val="0"/>
+        </w:rPr>
+        <w:t>Nueva defensa para paneles half-cut: el extractor de fichas infiere el número de celdas en serie (Ns) desde el conteo de semiceldas y lo verifica contra el Voc (regla práctica: Ns ≈ Voc / 0.74 en paneles HJT).</w:t>
+      </w:r>
+    </w:p>
+    <w:p>
+      <w:pPr>
+        <w:pStyle w:val="Listaconvietas"/>
+      </w:pPr>
+      <w:r>
+        <w:rPr>
+          <w:b w:val="0"/>
+        </w:rPr>
+        <w:t>Si el Ns auto-extraído es inconsistente, el Motor IV lo corrige al vuelo y el validador físico lo marca en el diagnóstico.</w:t>
+      </w:r>
+    </w:p>
+    <w:p>
+      <w:r>
+        <w:rPr>
+          <w:b/>
+          <w:color w:val="E65100"/>
+        </w:rPr>
+        <w:t>⚠️ Para no cometer errores: en paneles half-cut la ficha suele reportar el TOTAL de semiceldas (p. ej. 144); el Ns eléctrico es la mitad (72) porque hay dos strings en paralelo. Si cargas un panel a mano, verifica el Ns con la regla Voc/0.74.</w:t>
       </w:r>
     </w:p>
     <w:p>
@@ -2955,6 +3141,61 @@
       </w:r>
     </w:p>
     <w:p>
+      <w:r>
+        <w:rPr>
+          <w:b w:val="0"/>
+        </w:rPr>
+        <w:t>────────────────────────────────────────────────────────────</w:t>
+      </w:r>
+    </w:p>
+    <w:p>
+      <w:r>
+        <w:rPr>
+          <w:b/>
+        </w:rPr>
+        <w:t>Modo Granja agrivoltaica  NUEVO (5-ago-2026)</w:t>
+      </w:r>
+    </w:p>
+    <w:p>
+      <w:r>
+        <w:rPr>
+          <w:b w:val="0"/>
+        </w:rPr>
+        <w:t>Cuando el tipo de instalación es "Granja fotovoltaica", la Vista 3D ya no dibuja un edificio: muestra el terreno completo en verde (el cultivo) con las filas de paneles inclinadas y elevadas a 3 m cuando el factor de ocupación es menor a 100%.</w:t>
+      </w:r>
+    </w:p>
+    <w:p>
+      <w:pPr>
+        <w:pStyle w:val="Listaconvietas"/>
+      </w:pPr>
+      <w:r>
+        <w:rPr>
+          <w:b w:val="0"/>
+        </w:rPr>
+        <w:t>La separación entre filas se calcula como ancho del colector ÷ GCR (con 30% de ocupación, ~3.7 m entre ejes de filas).</w:t>
+      </w:r>
+    </w:p>
+    <w:p>
+      <w:pPr>
+        <w:pStyle w:val="Listaconvietas"/>
+      </w:pPr>
+      <w:r>
+        <w:rPr>
+          <w:b w:val="0"/>
+        </w:rPr>
+        <w:t>Un resumen indica número de filas, separación, altura de montaje y porcentaje de suelo libre para el cultivo.</w:t>
+      </w:r>
+    </w:p>
+    <w:p>
+      <w:r>
+        <w:rPr>
+          <w:b w:val="0"/>
+          <w:color w:val="1B5E20"/>
+        </w:rPr>
+        <w:t>Nota: la vista muestra las filas como bandas continuas, no módulos individuales. El conteo oficial de paneles sigue siendo el de la Página 4 — Dimensionamiento.</w:t>
+      </w:r>
+    </w:p>
+    <w:p>
       <w:pPr>
         <w:pStyle w:val="Ttulo2"/>
       </w:pPr>
@@ -3567,6 +3808,39 @@
     <w:p>
       <w:r>
         <w:rPr>
+          <w:b w:val="0"/>
+        </w:rPr>
+        <w:t>────────────────────────────────────────────────────────────</w:t>
+      </w:r>
+    </w:p>
+    <w:p>
+      <w:r>
+        <w:rPr>
+          <w:b/>
+        </w:rPr>
+        <w:t>Precio real del inversor del catálogo  NUEVO (5-ago-2026)</w:t>
+      </w:r>
+    </w:p>
+    <w:p>
+      <w:r>
+        <w:rPr>
+          <w:b w:val="0"/>
+        </w:rPr>
+        <w:t>El precio del inversor seleccionado en el catálogo fluye automáticamente al análisis financiero, en lugar de usar un estimado genérico por kW.</w:t>
+      </w:r>
+    </w:p>
+    <w:p>
+      <w:r>
+        <w:rPr>
+          <w:b/>
+          <w:color w:val="E65100"/>
+        </w:rPr>
+        <w:t>⚠️ Para no cometer errores: verifica que la ficha del inversor en el catálogo tenga precio cargado. Si el campo está vacío, revisa el valor que aparece en Financiero antes de generar el presupuesto.</w:t>
+      </w:r>
+    </w:p>
+    <w:p>
+      <w:r>
+        <w:rPr>
           <w:sz w:val="16"/>
         </w:rPr>
         <w:t>────────────────────────────────────────────────────────────</w:t>
@@ -7954,309 +8228,6 @@
           <w:b w:val="0"/>
         </w:rPr>
         <w:t>R: Sí, conviene corregirlo: cuando un modelo se repite, solo la última fila del Excel se carga y las demás se pierden sin aviso. La alerta indica el nombre y las filas exactas del Excel donde está el duplicado — elimina o renombra las filas sobrantes y recarga el catálogo.</w:t>
-      </w:r>
-    </w:p>
-    <w:p>
-      <w:r>
-        <w:rPr>
-          <w:b w:val="0"/>
-        </w:rPr>
-        <w:t>────────────────────────────────────────────────────────────</w:t>
-      </w:r>
-    </w:p>
-    <w:p>
-      <w:pPr>
-        <w:pStyle w:val="Ttulo2"/>
-      </w:pPr>
-      <w:r>
-        <w:rPr>
-          <w:b w:val="0"/>
-          <w:color w:val="1A5376"/>
-        </w:rPr>
-        <w:t>18. Anexo — Actualizaciones del 5 de agosto de 2026</w:t>
-      </w:r>
-    </w:p>
-    <w:p>
-      <w:r>
-        <w:rPr>
-          <w:b w:val="0"/>
-        </w:rPr>
-        <w:t>Esta entrega incorpora el soporte completo para proyectos agrivoltaicos (cultivo bajo paneles), la activación automática del Motor IV y el uso del precio real del inversor en el análisis financiero.</w:t>
-      </w:r>
-    </w:p>
-    <w:p>
-      <w:r>
-        <w:rPr>
-          <w:b w:val="0"/>
-        </w:rPr>
-        <w:t>────────────────────────────────────────────────────────────</w:t>
-      </w:r>
-    </w:p>
-    <w:p>
-      <w:r>
-        <w:rPr>
-          <w:b/>
-        </w:rPr>
-        <w:t>18.1 Página 1 — Proyecto: Factor de ocupación con paneles (agrivoltaica)  ACTUALIZADO</w:t>
-      </w:r>
-    </w:p>
-    <w:p>
-      <w:r>
-        <w:rPr>
-          <w:b w:val="0"/>
-        </w:rPr>
-        <w:t>Nuevo campo "Factor de ocupación con paneles (%)" (rango 5–100, por defecto 100). Define qué porcentaje del terreno bruto queda cubierto por paneles; el resto queda libre para el cultivo. La app calcula el área útil = área × factor/100 y la usa en Dimensionamiento, Presupuesto y Reporte PDF.</w:t>
-      </w:r>
-    </w:p>
-    <w:p>
-      <w:pPr>
-        <w:pStyle w:val="Listaconvietas"/>
-      </w:pPr>
-      <w:r>
-        <w:rPr>
-          <w:b w:val="0"/>
-        </w:rPr>
-        <w:t>Ejemplo: terreno de 3 000 m² con factor 30% → 900 m² útiles para paneles (~340 paneles en vez de ~1 040) y 2 100 m² libres para el cultivo.</w:t>
-      </w:r>
-    </w:p>
-    <w:p>
-      <w:pPr>
-        <w:pStyle w:val="Listaconvietas"/>
-      </w:pPr>
-      <w:r>
-        <w:rPr>
-          <w:b w:val="0"/>
-        </w:rPr>
-        <w:t>El factor se guarda en el proyecto (proyecto_actual.json) y se restaura al recargarlo.</w:t>
-      </w:r>
-    </w:p>
-    <w:p>
-      <w:r>
-        <w:rPr>
-          <w:b/>
-          <w:color w:val="E65100"/>
-        </w:rPr>
-        <w:t>⚠️ Para no cometer errores: si tu proyecto es una granja con cultivo, ajusta el factor ANTES de pasar a Dimensionamiento. Si lo dejas en 100%, el conteo de paneles, el presupuesto y el USD/m² se calcularán como si todo el terreno llevara paneles.</w:t>
-      </w:r>
-    </w:p>
-    <w:p>
-      <w:r>
-        <w:rPr>
-          <w:b w:val="0"/>
-        </w:rPr>
-        <w:t>────────────────────────────────────────────────────────────</w:t>
-      </w:r>
-    </w:p>
-    <w:p>
-      <w:r>
-        <w:rPr>
-          <w:b/>
-        </w:rPr>
-        <w:t>18.2 Página 2 — Recurso Solar: GCR sincronizado con el factor de ocupación  ACTUALIZADO</w:t>
-      </w:r>
-    </w:p>
-    <w:p>
-      <w:r>
-        <w:rPr>
-          <w:b w:val="0"/>
-        </w:rPr>
-        <w:t>El control "GCR (cobertura del suelo)" del modelo bifacial ahora arranca con el mismo valor que el factor de ocupación definido en Proyecto (factor 30% → GCR 0.30), porque ambos representan la misma fracción de suelo cubierta por paneles. La sincronización solo aplica la primera vez; después se respeta el valor que guardes aquí.</w:t>
-      </w:r>
-    </w:p>
-    <w:p>
-      <w:pPr>
-        <w:pStyle w:val="Listaconvietas"/>
-      </w:pPr>
-      <w:r>
-        <w:rPr>
-          <w:b w:val="0"/>
-        </w:rPr>
-        <w:t>Si el GCR y el factor difieren en más de 15 puntos, aparece una alerta con el valor sugerido — el sombreado entre filas y el conteo de paneles estarían usando supuestos distintos.</w:t>
-      </w:r>
-    </w:p>
-    <w:p>
-      <w:r>
-        <w:rPr>
-          <w:b/>
-          <w:color w:val="E65100"/>
-        </w:rPr>
-        <w:t>⚠️ Para no cometer errores: no subas el GCR "para producir más" sin cambiar también el factor de ocupación en Proyecto. Un GCR alto junta las filas (más sombra mutua y menos luz al cultivo); mantén ambos valores alineados.</w:t>
-      </w:r>
-    </w:p>
-    <w:p>
-      <w:r>
-        <w:rPr>
-          <w:b w:val="0"/>
-        </w:rPr>
-        <w:t>────────────────────────────────────────────────────────────</w:t>
-      </w:r>
-    </w:p>
-    <w:p>
-      <w:r>
-        <w:rPr>
-          <w:b/>
-        </w:rPr>
-        <w:t>18.3 Página 9 — Vista 3D: modo Granja agrivoltaica  NUEVO</w:t>
-      </w:r>
-    </w:p>
-    <w:p>
-      <w:r>
-        <w:rPr>
-          <w:b w:val="0"/>
-        </w:rPr>
-        <w:t>Cuando el tipo de instalación es "Granja fotovoltaica", la Vista 3D ya no dibuja un edificio: muestra el terreno completo en verde (el cultivo) con las filas de paneles inclinadas y elevadas a 3 m cuando el factor de ocupación es menor a 100%.</w:t>
-      </w:r>
-    </w:p>
-    <w:p>
-      <w:pPr>
-        <w:pStyle w:val="Listaconvietas"/>
-      </w:pPr>
-      <w:r>
-        <w:rPr>
-          <w:b w:val="0"/>
-        </w:rPr>
-        <w:t>La separación entre filas se calcula como ancho del colector ÷ GCR (con 30% de ocupación, ~3.7 m entre ejes de filas).</w:t>
-      </w:r>
-    </w:p>
-    <w:p>
-      <w:pPr>
-        <w:pStyle w:val="Listaconvietas"/>
-      </w:pPr>
-      <w:r>
-        <w:rPr>
-          <w:b w:val="0"/>
-        </w:rPr>
-        <w:t>Un resumen indica número de filas, separación, altura de montaje y porcentaje de suelo libre para el cultivo.</w:t>
-      </w:r>
-    </w:p>
-    <w:p>
-      <w:r>
-        <w:rPr>
-          <w:b w:val="0"/>
-          <w:color w:val="1B5E20"/>
-        </w:rPr>
-        <w:t>Nota: la vista muestra las filas como bandas continuas, no módulos individuales. El conteo oficial de paneles sigue siendo el de la Página 4 — Dimensionamiento.</w:t>
-      </w:r>
-    </w:p>
-    <w:p>
-      <w:r>
-        <w:rPr>
-          <w:b w:val="0"/>
-        </w:rPr>
-        <w:t>────────────────────────────────────────────────────────────</w:t>
-      </w:r>
-    </w:p>
-    <w:p>
-      <w:r>
-        <w:rPr>
-          <w:b/>
-        </w:rPr>
-        <w:t>18.4 Página 7 — Financiero: precio real del inversor del catálogo  ACTUALIZADO</w:t>
-      </w:r>
-    </w:p>
-    <w:p>
-      <w:r>
-        <w:rPr>
-          <w:b w:val="0"/>
-        </w:rPr>
-        <w:t>El precio del inversor seleccionado en el catálogo fluye automáticamente al análisis financiero, en lugar de usar un estimado genérico por kW.</w:t>
-      </w:r>
-    </w:p>
-    <w:p>
-      <w:r>
-        <w:rPr>
-          <w:b/>
-          <w:color w:val="E65100"/>
-        </w:rPr>
-        <w:t>⚠️ Para no cometer errores: verifica que la ficha del inversor en el catálogo tenga precio cargado. Si el campo está vacío, revisa el valor que aparece en Financiero antes de generar el presupuesto.</w:t>
-      </w:r>
-    </w:p>
-    <w:p>
-      <w:r>
-        <w:rPr>
-          <w:b w:val="0"/>
-        </w:rPr>
-        <w:t>────────────────────────────────────────────────────────────</w:t>
-      </w:r>
-    </w:p>
-    <w:p>
-      <w:r>
-        <w:rPr>
-          <w:b/>
-        </w:rPr>
-        <w:t>18.5 Página 3 — Motor IV: activación automática y defensa Ns half-cut  ACTUALIZADO</w:t>
-      </w:r>
-    </w:p>
-    <w:p>
-      <w:r>
-        <w:rPr>
-          <w:b w:val="0"/>
-        </w:rPr>
-        <w:t>Si el panel seleccionado tiene su ficha técnica completa (Voc, Isc, Vmp, Imp, Ns y coeficientes térmicos), el Motor IV se activa automáticamente sin configuración manual.</w:t>
-      </w:r>
-    </w:p>
-    <w:p>
-      <w:pPr>
-        <w:pStyle w:val="Listaconvietas"/>
-      </w:pPr>
-      <w:r>
-        <w:rPr>
-          <w:b w:val="0"/>
-        </w:rPr>
-        <w:t>Nueva defensa para paneles half-cut: el extractor de fichas infiere el número de celdas en serie (Ns) desde el conteo de semiceldas y lo verifica contra el Voc (regla práctica: Ns ≈ Voc / 0.74 en paneles HJT).</w:t>
-      </w:r>
-    </w:p>
-    <w:p>
-      <w:pPr>
-        <w:pStyle w:val="Listaconvietas"/>
-      </w:pPr>
-      <w:r>
-        <w:rPr>
-          <w:b w:val="0"/>
-        </w:rPr>
-        <w:t>Si el Ns auto-extraído es inconsistente, el Motor IV lo corrige al vuelo y el validador físico lo marca en el diagnóstico.</w:t>
-      </w:r>
-    </w:p>
-    <w:p>
-      <w:r>
-        <w:rPr>
-          <w:b/>
-          <w:color w:val="E65100"/>
-        </w:rPr>
-        <w:t>⚠️ Para no cometer errores: en paneles half-cut la ficha suele reportar el TOTAL de semiceldas (p. ej. 144); el Ns eléctrico es la mitad (72) porque hay dos strings en paralelo. Si cargas un panel a mano, verifica el Ns con la regla Voc/0.74.</w:t>
-      </w:r>
-    </w:p>
-    <w:p>
-      <w:r>
-        <w:rPr>
-          <w:b w:val="0"/>
-        </w:rPr>
-        <w:t>────────────────────────────────────────────────────────────</w:t>
-      </w:r>
-    </w:p>
-    <w:p>
-      <w:r>
-        <w:rPr>
-          <w:b/>
-        </w:rPr>
-        <w:t>18.6 Flujo recomendado para proyectos agrivoltaicos</w:t>
-      </w:r>
-    </w:p>
-    <w:p>
-      <w:r>
-        <w:rPr>
-          <w:b w:val="0"/>
-        </w:rPr>
-        <w:t>1 Proyecto (tipo Granja fotovoltaica + factor de ocupación) → 2 Recurso Solar (verificar GCR sincronizado → Calcular POA) → 4 Dimensionamiento (área útil) → 9 Vista 3D (verificación visual de filas y cultivo) → 6 Producción → 7 Financiero → 8 Presupuesto → 10 Reporte PDF.</w:t>
-      </w:r>
-    </w:p>
-    <w:p>
-      <w:r>
-        <w:rPr>
-          <w:b w:val="0"/>
-          <w:color w:val="1B5E20"/>
-        </w:rPr>
-        <w:t>Regla de oro agrivoltaica: factor de ocupación (Proyecto) = GCR (Recurso Solar). Si cambias uno, revisa el otro.</w:t>
       </w:r>
     </w:p>
     <w:p>

</xml_diff>